<commit_message>
feat: ajustes templates e seeder Cardoso
</commit_message>
<xml_diff>
--- a/resources/templates/recibo_4.docx
+++ b/resources/templates/recibo_4.docx
@@ -14,7 +14,7 @@
       </w:tblGrid>
       <w:tr>
         <w:trPr>
-          <w:trHeight w:val="3393"/>
+          <w:trHeight w:val="3541"/>
         </w:trPr>
         <w:tc>
           <w:tcPr>
@@ -46,7 +46,7 @@
                   <v:stroke joinstyle="miter"/>
                   <v:path gradientshapeok="t" o:connecttype="rect"/>
                 </v:shapetype>
-                <v:shape id="Caixa de Texto 2" o:spid="_x0000_s1026" type="#_x0000_t202" style="position:absolute;margin-left:186.45pt;margin-top:3.7pt;width:267.75pt;height:147.75pt;z-index:2;visibility:visible;mso-wrap-distance-left:9pt;mso-wrap-distance-top:0;mso-wrap-distance-right:9pt;mso-wrap-distance-bottom:0;mso-position-horizontal:absolute;mso-position-horizontal-relative:text;mso-position-vertical:absolute;mso-position-vertical-relative:text;v-text-anchor:top" o:gfxdata="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" strokecolor="white" strokeweight=".05pt">
+                <v:shape id="Caixa de Texto 2" o:spid="_x0000_s1026" type="#_x0000_t202" style="position:absolute;margin-left:160.2pt;margin-top:3.7pt;width:294pt;height:162.3pt;z-index:2;visibility:visible;mso-wrap-style:square;mso-wrap-distance-left:9pt;mso-wrap-distance-top:0;mso-wrap-distance-right:9pt;mso-wrap-distance-bottom:0;mso-position-horizontal:absolute;mso-position-horizontal-relative:text;mso-position-vertical:absolute;mso-position-vertical-relative:text;v-text-anchor:top" o:gfxdata="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" strokecolor="white" strokeweight=".05pt">
                   <v:textbox style="mso-next-textbox:#Caixa de Texto 2">
                     <w:txbxContent>
                       <w:p>
@@ -66,6 +66,10 @@
                         <w:pPr>
                           <w:pStyle w:val="FrameContents"/>
                           <w:jc w:val="center"/>
+                          <w:rPr>
+                            <w:b/>
+                            <w:sz w:val="20"/>
+                          </w:rPr>
                         </w:pPr>
                         <w:r>
                           <w:rPr>
@@ -73,44 +77,6 @@
                             <w:sz w:val="20"/>
                           </w:rPr>
                           <w:t>FRONTEIRA E REGIÃO “CHICO SIMPLÍCIO” Z-14</w:t>
-                        </w:r>
-                      </w:p>
-                      <w:p>
-                        <w:pPr>
-                          <w:pStyle w:val="FrameContents"/>
-                          <w:jc w:val="center"/>
-                          <w:rPr>
-                            <w:b/>
-                            <w:sz w:val="20"/>
-                          </w:rPr>
-                        </w:pPr>
-                        <w:r>
-                          <w:rPr>
-                            <w:b/>
-                            <w:sz w:val="20"/>
-                          </w:rPr>
-                          <w:t>Avenida João Gonçalves do Nascimento, 1015</w:t>
-                        </w:r>
-                        <w:r>
-                          <w:rPr>
-                            <w:b/>
-                            <w:sz w:val="20"/>
-                          </w:rPr>
-                          <w:t xml:space="preserve"> </w:t>
-                        </w:r>
-                        <w:r>
-                          <w:rPr>
-                            <w:b/>
-                            <w:sz w:val="20"/>
-                          </w:rPr>
-                          <w:t xml:space="preserve">– </w:t>
-                        </w:r>
-                        <w:r>
-                          <w:rPr>
-                            <w:b/>
-                            <w:sz w:val="20"/>
-                          </w:rPr>
-                          <w:t>Centro</w:t>
                         </w:r>
                       </w:p>
                       <w:p>
@@ -123,6 +89,57 @@
                             <w:b/>
                             <w:sz w:val="20"/>
                           </w:rPr>
+                          <w:t>COM ATENDIMENTO EM CARDOSO-SP</w:t>
+                        </w:r>
+                      </w:p>
+                      <w:p>
+                        <w:pPr>
+                          <w:pStyle w:val="FrameContents"/>
+                          <w:jc w:val="center"/>
+                          <w:rPr>
+                            <w:b/>
+                            <w:sz w:val="20"/>
+                          </w:rPr>
+                        </w:pPr>
+                        <w:r>
+                          <w:rPr>
+                            <w:b/>
+                            <w:sz w:val="20"/>
+                          </w:rPr>
+                          <w:t>Avenida João Gonçalves do Nascimento</w:t>
+                        </w:r>
+                        <w:r>
+                          <w:rPr>
+                            <w:b/>
+                            <w:sz w:val="20"/>
+                          </w:rPr>
+                          <w:t xml:space="preserve"> </w:t>
+                        </w:r>
+                        <w:r>
+                          <w:rPr>
+                            <w:b/>
+                            <w:sz w:val="20"/>
+                          </w:rPr>
+                          <w:t>1015</w:t>
+                        </w:r>
+                        <w:r>
+                          <w:rPr>
+                            <w:b/>
+                            <w:sz w:val="20"/>
+                          </w:rPr>
+                          <w:t xml:space="preserve"> Centro</w:t>
+                        </w:r>
+                      </w:p>
+                      <w:p>
+                        <w:pPr>
+                          <w:pStyle w:val="FrameContents"/>
+                          <w:jc w:val="center"/>
+                        </w:pPr>
+                        <w:r>
+                          <w:rPr>
+                            <w:b/>
+                            <w:sz w:val="20"/>
+                          </w:rPr>
                           <w:t xml:space="preserve">CEP: </w:t>
                         </w:r>
                         <w:r>
@@ -130,7 +147,7 @@
                             <w:b/>
                             <w:sz w:val="20"/>
                           </w:rPr>
-                          <w:t>15570</w:t>
+                          <w:t>15.570</w:t>
                         </w:r>
                         <w:r>
                           <w:rPr>
@@ -156,6 +173,7 @@
                             <w:szCs w:val="22"/>
                           </w:rPr>
                         </w:pPr>
+                        <w:proofErr w:type="spellStart"/>
                         <w:r>
                           <w:rPr>
                             <w:rFonts w:ascii="Monotype Corsiva" w:hAnsi="Monotype Corsiva" w:cs="Monotype Corsiva"/>
@@ -164,7 +182,48 @@
                             <w:sz w:val="22"/>
                             <w:szCs w:val="22"/>
                           </w:rPr>
-                          <w:t>Tel./ (0xx34) 3428-2069</w:t>
+                          <w:t>Cel</w:t>
+                        </w:r>
+                        <w:proofErr w:type="spellEnd"/>
+                        <w:r>
+                          <w:rPr>
+                            <w:rFonts w:ascii="Monotype Corsiva" w:hAnsi="Monotype Corsiva" w:cs="Monotype Corsiva"/>
+                            <w:b/>
+                            <w:i/>
+                            <w:sz w:val="22"/>
+                            <w:szCs w:val="22"/>
+                          </w:rPr>
+                          <w:t xml:space="preserve">: </w:t>
+                        </w:r>
+                        <w:r>
+                          <w:rPr>
+                            <w:rFonts w:ascii="Monotype Corsiva" w:hAnsi="Monotype Corsiva" w:cs="Monotype Corsiva"/>
+                            <w:b/>
+                            <w:i/>
+                            <w:sz w:val="22"/>
+                            <w:szCs w:val="22"/>
+                          </w:rPr>
+                          <w:t>(17)</w:t>
+                        </w:r>
+                        <w:r>
+                          <w:rPr>
+                            <w:rFonts w:ascii="Monotype Corsiva" w:hAnsi="Monotype Corsiva" w:cs="Monotype Corsiva"/>
+                            <w:b/>
+                            <w:i/>
+                            <w:sz w:val="22"/>
+                            <w:szCs w:val="22"/>
+                          </w:rPr>
+                          <w:t xml:space="preserve"> </w:t>
+                        </w:r>
+                        <w:r>
+                          <w:rPr>
+                            <w:rFonts w:ascii="Monotype Corsiva" w:hAnsi="Monotype Corsiva" w:cs="Monotype Corsiva"/>
+                            <w:b/>
+                            <w:i/>
+                            <w:sz w:val="22"/>
+                            <w:szCs w:val="22"/>
+                          </w:rPr>
+                          <w:t>9 9643-9188</w:t>
                         </w:r>
                       </w:p>
                       <w:p>
@@ -175,9 +234,6 @@
                             <w:tab w:val="center" w:pos="4472"/>
                           </w:tabs>
                           <w:jc w:val="center"/>
-                        </w:pPr>
-                        <w:proofErr w:type="spellStart"/>
-                        <w:r>
                           <w:rPr>
                             <w:rFonts w:ascii="Monotype Corsiva" w:hAnsi="Monotype Corsiva" w:cs="Monotype Corsiva"/>
                             <w:b/>
@@ -185,9 +241,8 @@
                             <w:sz w:val="22"/>
                             <w:szCs w:val="22"/>
                           </w:rPr>
-                          <w:t>Cel</w:t>
-                        </w:r>
-                        <w:proofErr w:type="spellEnd"/>
+                        </w:pPr>
+                        <w:proofErr w:type="gramStart"/>
                         <w:r>
                           <w:rPr>
                             <w:rFonts w:ascii="Monotype Corsiva" w:hAnsi="Monotype Corsiva" w:cs="Monotype Corsiva"/>
@@ -196,11 +251,9 @@
                             <w:sz w:val="22"/>
                             <w:szCs w:val="22"/>
                           </w:rPr>
-                          <w:t>:</w:t>
-                        </w:r>
-                        <w:r>
-                          <w:t xml:space="preserve"> </w:t>
-                        </w:r>
+                          <w:t>CNPJ  nº</w:t>
+                        </w:r>
+                        <w:proofErr w:type="gramEnd"/>
                         <w:r>
                           <w:rPr>
                             <w:rFonts w:ascii="Monotype Corsiva" w:hAnsi="Monotype Corsiva" w:cs="Monotype Corsiva"/>
@@ -209,7 +262,7 @@
                             <w:sz w:val="22"/>
                             <w:szCs w:val="22"/>
                           </w:rPr>
-                          <w:t>(17)9 9643-9188</w:t>
+                          <w:t>. 04.247.647 / 0001-73</w:t>
                         </w:r>
                       </w:p>
                       <w:p>
@@ -220,9 +273,6 @@
                             <w:tab w:val="center" w:pos="4472"/>
                           </w:tabs>
                           <w:jc w:val="center"/>
-                        </w:pPr>
-                        <w:proofErr w:type="gramStart"/>
-                        <w:r>
                           <w:rPr>
                             <w:rFonts w:ascii="Monotype Corsiva" w:hAnsi="Monotype Corsiva" w:cs="Monotype Corsiva"/>
                             <w:b/>
@@ -230,9 +280,7 @@
                             <w:sz w:val="22"/>
                             <w:szCs w:val="22"/>
                           </w:rPr>
-                          <w:t>CNPJ  nº</w:t>
-                        </w:r>
-                        <w:proofErr w:type="gramEnd"/>
+                        </w:pPr>
                         <w:r>
                           <w:rPr>
                             <w:rFonts w:ascii="Monotype Corsiva" w:hAnsi="Monotype Corsiva" w:cs="Monotype Corsiva"/>
@@ -241,7 +289,17 @@
                             <w:sz w:val="22"/>
                             <w:szCs w:val="22"/>
                           </w:rPr>
-                          <w:t>. 04.247.647 / 0001-73</w:t>
+                          <w:t xml:space="preserve">Email: </w:t>
+                        </w:r>
+                        <w:r>
+                          <w:rPr>
+                            <w:rFonts w:ascii="Monotype Corsiva" w:hAnsi="Monotype Corsiva" w:cs="Monotype Corsiva"/>
+                            <w:b/>
+                            <w:i/>
+                            <w:sz w:val="22"/>
+                            <w:szCs w:val="22"/>
+                          </w:rPr>
+                          <w:t>coloniacardosoz-14@hotmail.com</w:t>
                         </w:r>
                       </w:p>
                       <w:p>
@@ -293,10 +351,10 @@
                 <w:noProof/>
               </w:rPr>
               <w:drawing>
-                <wp:inline distT="0" distB="0" distL="0" distR="0" wp14:anchorId="743FC7E2" wp14:editId="0211DEB7">
-                  <wp:extent cx="2368434" cy="2019300"/>
+                <wp:inline distT="0" distB="0" distL="0" distR="0" wp14:anchorId="38AC2366" wp14:editId="3ED6D579">
+                  <wp:extent cx="1962150" cy="1257300"/>
                   <wp:effectExtent l="0" t="0" r="0" b="0"/>
-                  <wp:docPr id="2083534762" name="Imagem 6"/>
+                  <wp:docPr id="1" name="Figura2"/>
                   <wp:cNvGraphicFramePr>
                     <a:graphicFrameLocks xmlns:a="http://schemas.openxmlformats.org/drawingml/2006/main" noChangeAspect="1"/>
                   </wp:cNvGraphicFramePr>
@@ -304,25 +362,21 @@
                     <a:graphicData uri="http://schemas.openxmlformats.org/drawingml/2006/picture">
                       <pic:pic xmlns:pic="http://schemas.openxmlformats.org/drawingml/2006/picture">
                         <pic:nvPicPr>
-                          <pic:cNvPr id="2083534762" name="Imagem 2083534762"/>
-                          <pic:cNvPicPr/>
+                          <pic:cNvPr id="1" name="Figura2"/>
+                          <pic:cNvPicPr>
+                            <a:picLocks noChangeAspect="1" noChangeArrowheads="1"/>
+                          </pic:cNvPicPr>
                         </pic:nvPicPr>
                         <pic:blipFill>
-                          <a:blip r:embed="rId4" cstate="print">
-                            <a:extLst>
-                              <a:ext uri="{28A0092B-C50C-407E-A947-70E740481C1C}">
-                                <a14:useLocalDpi xmlns:a14="http://schemas.microsoft.com/office/drawing/2010/main" val="0"/>
-                              </a:ext>
-                            </a:extLst>
-                          </a:blip>
+                          <a:blip r:embed="rId4"/>
                           <a:stretch>
                             <a:fillRect/>
                           </a:stretch>
                         </pic:blipFill>
-                        <pic:spPr>
+                        <pic:spPr bwMode="auto">
                           <a:xfrm>
                             <a:off x="0" y="0"/>
-                            <a:ext cx="2374383" cy="2024372"/>
+                            <a:ext cx="1962150" cy="1257300"/>
                           </a:xfrm>
                           <a:prstGeom prst="rect">
                             <a:avLst/>
@@ -1256,7 +1310,6 @@
   <w:style w:type="character" w:default="1" w:styleId="Fontepargpadro">
     <w:name w:val="Default Paragraph Font"/>
     <w:uiPriority w:val="1"/>
-    <w:semiHidden/>
     <w:unhideWhenUsed/>
   </w:style>
   <w:style w:type="table" w:default="1" w:styleId="Tabelanormal">

</xml_diff>